<commit_message>
style: polish requirement form template layout
</commit_message>
<xml_diff>
--- a/output/doc/Application_Group_Requirement_Form.docx
+++ b/output/doc/Application_Group_Requirement_Form.docx
@@ -4,14 +4,15 @@
   <w:body>
     <w:p>
       <w:pPr>
+        <w:spacing w:after="0"/>
         <w:jc w:val="center"/>
       </w:pPr>
       <w:r>
         <w:rPr>
-          <w:rFonts w:ascii="Microsoft YaHei" w:hAnsi="Microsoft YaHei" w:eastAsia="Microsoft YaHei"/>
+          <w:rFonts w:ascii="Hiragino Sans GB" w:hAnsi="Hiragino Sans GB" w:eastAsia="Hiragino Sans GB" w:cs="Hiragino Sans GB"/>
           <w:b/>
           <w:color w:val="1F4E79"/>
-          <w:sz w:val="36"/>
+          <w:sz w:val="34"/>
         </w:rPr>
         <w:t>Application Group Requirement Collection Form</w:t>
       </w:r>
@@ -19,14 +20,14 @@
     <w:p>
       <w:r>
         <w:rPr>
-          <w:rFonts w:ascii="Microsoft YaHei" w:hAnsi="Microsoft YaHei" w:eastAsia="Microsoft YaHei"/>
+          <w:rFonts w:ascii="Hiragino Sans GB" w:hAnsi="Hiragino Sans GB" w:eastAsia="Hiragino Sans GB" w:cs="Hiragino Sans GB"/>
           <w:b/>
         </w:rPr>
         <w:t xml:space="preserve">Purpose / 填写目的: </w:t>
       </w:r>
       <w:r>
         <w:rPr>
-          <w:rFonts w:ascii="Microsoft YaHei" w:hAnsi="Microsoft YaHei" w:eastAsia="Microsoft YaHei"/>
+          <w:rFonts w:ascii="Hiragino Sans GB" w:hAnsi="Hiragino Sans GB" w:eastAsia="Hiragino Sans GB" w:cs="Hiragino Sans GB"/>
         </w:rPr>
         <w:t>This form is used to collect your group's feature requests, technical coordination needs, and collaboration expectations for later review and planning.</w:t>
       </w:r>
@@ -34,14 +35,14 @@
     <w:p>
       <w:r>
         <w:rPr>
-          <w:rFonts w:ascii="Microsoft YaHei" w:hAnsi="Microsoft YaHei" w:eastAsia="Microsoft YaHei"/>
+          <w:rFonts w:ascii="Hiragino Sans GB" w:hAnsi="Hiragino Sans GB" w:eastAsia="Hiragino Sans GB" w:cs="Hiragino Sans GB"/>
           <w:b/>
         </w:rPr>
         <w:t xml:space="preserve">Instructions / 填写说明: </w:t>
       </w:r>
       <w:r>
         <w:rPr>
-          <w:rFonts w:ascii="Microsoft YaHei" w:hAnsi="Microsoft YaHei" w:eastAsia="Microsoft YaHei"/>
+          <w:rFonts w:ascii="Hiragino Sans GB" w:hAnsi="Hiragino Sans GB" w:eastAsia="Hiragino Sans GB" w:cs="Hiragino Sans GB"/>
         </w:rPr>
         <w:t>Each group should complete one form. Fill Part A once. Use Part B for multiple requirement items. Rough answers are acceptable if details are not final yet.</w:t>
       </w:r>
@@ -61,13 +62,13 @@
         <w:tblLook w:firstColumn="1" w:firstRow="1" w:lastColumn="0" w:lastRow="0" w:noHBand="0" w:noVBand="1" w:val="04A0"/>
       </w:tblPr>
       <w:tblGrid>
-        <w:gridCol w:w="5040"/>
-        <w:gridCol w:w="5040"/>
+        <w:gridCol w:w="5112"/>
+        <w:gridCol w:w="5112"/>
       </w:tblGrid>
       <w:tr>
         <w:tc>
           <w:tcPr>
-            <w:tcW w:type="dxa" w:w="5040"/>
+            <w:tcW w:type="dxa" w:w="5112"/>
             <w:shd w:fill="D9EAF7"/>
           </w:tcPr>
           <w:p>
@@ -78,7 +79,7 @@
         </w:tc>
         <w:tc>
           <w:tcPr>
-            <w:tcW w:type="dxa" w:w="5040"/>
+            <w:tcW w:type="dxa" w:w="5112"/>
             <w:shd w:fill="D9EAF7"/>
           </w:tcPr>
           <w:p>
@@ -91,7 +92,7 @@
       <w:tr>
         <w:tc>
           <w:tcPr>
-            <w:tcW w:type="dxa" w:w="5040"/>
+            <w:tcW w:type="dxa" w:w="5112"/>
           </w:tcPr>
           <w:p>
             <w:r>
@@ -101,7 +102,7 @@
         </w:tc>
         <w:tc>
           <w:tcPr>
-            <w:tcW w:type="dxa" w:w="5040"/>
+            <w:tcW w:type="dxa" w:w="5112"/>
           </w:tcPr>
           <w:p>
             <w:r/>
@@ -111,7 +112,7 @@
       <w:tr>
         <w:tc>
           <w:tcPr>
-            <w:tcW w:type="dxa" w:w="5040"/>
+            <w:tcW w:type="dxa" w:w="5112"/>
           </w:tcPr>
           <w:p>
             <w:r>
@@ -121,7 +122,7 @@
         </w:tc>
         <w:tc>
           <w:tcPr>
-            <w:tcW w:type="dxa" w:w="5040"/>
+            <w:tcW w:type="dxa" w:w="5112"/>
           </w:tcPr>
           <w:p>
             <w:r/>
@@ -131,7 +132,7 @@
       <w:tr>
         <w:tc>
           <w:tcPr>
-            <w:tcW w:type="dxa" w:w="5040"/>
+            <w:tcW w:type="dxa" w:w="5112"/>
           </w:tcPr>
           <w:p>
             <w:r>
@@ -141,7 +142,7 @@
         </w:tc>
         <w:tc>
           <w:tcPr>
-            <w:tcW w:type="dxa" w:w="5040"/>
+            <w:tcW w:type="dxa" w:w="5112"/>
           </w:tcPr>
           <w:p>
             <w:r/>
@@ -151,7 +152,7 @@
       <w:tr>
         <w:tc>
           <w:tcPr>
-            <w:tcW w:type="dxa" w:w="5040"/>
+            <w:tcW w:type="dxa" w:w="5112"/>
           </w:tcPr>
           <w:p>
             <w:r>
@@ -161,7 +162,7 @@
         </w:tc>
         <w:tc>
           <w:tcPr>
-            <w:tcW w:type="dxa" w:w="5040"/>
+            <w:tcW w:type="dxa" w:w="5112"/>
           </w:tcPr>
           <w:p>
             <w:r/>
@@ -171,7 +172,7 @@
       <w:tr>
         <w:tc>
           <w:tcPr>
-            <w:tcW w:type="dxa" w:w="5040"/>
+            <w:tcW w:type="dxa" w:w="5112"/>
           </w:tcPr>
           <w:p>
             <w:r>
@@ -181,7 +182,7 @@
         </w:tc>
         <w:tc>
           <w:tcPr>
-            <w:tcW w:type="dxa" w:w="5040"/>
+            <w:tcW w:type="dxa" w:w="5112"/>
           </w:tcPr>
           <w:p>
             <w:r/>
@@ -191,7 +192,7 @@
       <w:tr>
         <w:tc>
           <w:tcPr>
-            <w:tcW w:type="dxa" w:w="5040"/>
+            <w:tcW w:type="dxa" w:w="5112"/>
           </w:tcPr>
           <w:p>
             <w:r>
@@ -201,7 +202,7 @@
         </w:tc>
         <w:tc>
           <w:tcPr>
-            <w:tcW w:type="dxa" w:w="5040"/>
+            <w:tcW w:type="dxa" w:w="5112"/>
           </w:tcPr>
           <w:p>
             <w:r/>
@@ -211,7 +212,7 @@
       <w:tr>
         <w:tc>
           <w:tcPr>
-            <w:tcW w:type="dxa" w:w="5040"/>
+            <w:tcW w:type="dxa" w:w="5112"/>
           </w:tcPr>
           <w:p>
             <w:r>
@@ -221,7 +222,7 @@
         </w:tc>
         <w:tc>
           <w:tcPr>
-            <w:tcW w:type="dxa" w:w="5040"/>
+            <w:tcW w:type="dxa" w:w="5112"/>
           </w:tcPr>
           <w:p>
             <w:r/>
@@ -231,7 +232,7 @@
       <w:tr>
         <w:tc>
           <w:tcPr>
-            <w:tcW w:type="dxa" w:w="5040"/>
+            <w:tcW w:type="dxa" w:w="5112"/>
           </w:tcPr>
           <w:p>
             <w:r>
@@ -241,7 +242,7 @@
         </w:tc>
         <w:tc>
           <w:tcPr>
-            <w:tcW w:type="dxa" w:w="5040"/>
+            <w:tcW w:type="dxa" w:w="5112"/>
           </w:tcPr>
           <w:p>
             <w:r/>
@@ -265,22 +266,22 @@
         <w:tblLook w:firstColumn="1" w:firstRow="1" w:lastColumn="0" w:lastRow="0" w:noHBand="0" w:noVBand="1" w:val="04A0"/>
       </w:tblPr>
       <w:tblGrid>
-        <w:gridCol w:w="916"/>
-        <w:gridCol w:w="916"/>
-        <w:gridCol w:w="916"/>
-        <w:gridCol w:w="916"/>
-        <w:gridCol w:w="916"/>
-        <w:gridCol w:w="916"/>
-        <w:gridCol w:w="916"/>
-        <w:gridCol w:w="916"/>
-        <w:gridCol w:w="916"/>
-        <w:gridCol w:w="916"/>
-        <w:gridCol w:w="916"/>
+        <w:gridCol w:w="929"/>
+        <w:gridCol w:w="929"/>
+        <w:gridCol w:w="929"/>
+        <w:gridCol w:w="929"/>
+        <w:gridCol w:w="929"/>
+        <w:gridCol w:w="929"/>
+        <w:gridCol w:w="929"/>
+        <w:gridCol w:w="929"/>
+        <w:gridCol w:w="929"/>
+        <w:gridCol w:w="929"/>
+        <w:gridCol w:w="929"/>
       </w:tblGrid>
       <w:tr>
         <w:tc>
           <w:tcPr>
-            <w:tcW w:type="dxa" w:w="916"/>
+            <w:tcW w:type="dxa" w:w="929"/>
             <w:shd w:fill="D9EAF7"/>
           </w:tcPr>
           <w:p>
@@ -293,7 +294,7 @@
         </w:tc>
         <w:tc>
           <w:tcPr>
-            <w:tcW w:type="dxa" w:w="916"/>
+            <w:tcW w:type="dxa" w:w="929"/>
             <w:shd w:fill="D9EAF7"/>
           </w:tcPr>
           <w:p>
@@ -306,7 +307,7 @@
         </w:tc>
         <w:tc>
           <w:tcPr>
-            <w:tcW w:type="dxa" w:w="916"/>
+            <w:tcW w:type="dxa" w:w="929"/>
             <w:shd w:fill="D9EAF7"/>
           </w:tcPr>
           <w:p>
@@ -319,7 +320,7 @@
         </w:tc>
         <w:tc>
           <w:tcPr>
-            <w:tcW w:type="dxa" w:w="916"/>
+            <w:tcW w:type="dxa" w:w="929"/>
             <w:shd w:fill="D9EAF7"/>
           </w:tcPr>
           <w:p>
@@ -332,7 +333,7 @@
         </w:tc>
         <w:tc>
           <w:tcPr>
-            <w:tcW w:type="dxa" w:w="916"/>
+            <w:tcW w:type="dxa" w:w="929"/>
             <w:shd w:fill="D9EAF7"/>
           </w:tcPr>
           <w:p>
@@ -345,7 +346,7 @@
         </w:tc>
         <w:tc>
           <w:tcPr>
-            <w:tcW w:type="dxa" w:w="916"/>
+            <w:tcW w:type="dxa" w:w="929"/>
             <w:shd w:fill="D9EAF7"/>
           </w:tcPr>
           <w:p>
@@ -358,7 +359,7 @@
         </w:tc>
         <w:tc>
           <w:tcPr>
-            <w:tcW w:type="dxa" w:w="916"/>
+            <w:tcW w:type="dxa" w:w="929"/>
             <w:shd w:fill="D9EAF7"/>
           </w:tcPr>
           <w:p>
@@ -371,7 +372,7 @@
         </w:tc>
         <w:tc>
           <w:tcPr>
-            <w:tcW w:type="dxa" w:w="916"/>
+            <w:tcW w:type="dxa" w:w="929"/>
             <w:shd w:fill="D9EAF7"/>
           </w:tcPr>
           <w:p>
@@ -384,7 +385,7 @@
         </w:tc>
         <w:tc>
           <w:tcPr>
-            <w:tcW w:type="dxa" w:w="916"/>
+            <w:tcW w:type="dxa" w:w="929"/>
             <w:shd w:fill="D9EAF7"/>
           </w:tcPr>
           <w:p>
@@ -397,7 +398,7 @@
         </w:tc>
         <w:tc>
           <w:tcPr>
-            <w:tcW w:type="dxa" w:w="916"/>
+            <w:tcW w:type="dxa" w:w="929"/>
             <w:shd w:fill="D9EAF7"/>
           </w:tcPr>
           <w:p>
@@ -410,7 +411,7 @@
         </w:tc>
         <w:tc>
           <w:tcPr>
-            <w:tcW w:type="dxa" w:w="916"/>
+            <w:tcW w:type="dxa" w:w="929"/>
             <w:shd w:fill="D9EAF7"/>
           </w:tcPr>
           <w:p>
@@ -425,7 +426,7 @@
       <w:tr>
         <w:tc>
           <w:tcPr>
-            <w:tcW w:type="dxa" w:w="916"/>
+            <w:tcW w:type="dxa" w:w="929"/>
           </w:tcPr>
           <w:p>
             <w:r/>
@@ -433,7 +434,7 @@
         </w:tc>
         <w:tc>
           <w:tcPr>
-            <w:tcW w:type="dxa" w:w="916"/>
+            <w:tcW w:type="dxa" w:w="929"/>
           </w:tcPr>
           <w:p>
             <w:r/>
@@ -441,7 +442,7 @@
         </w:tc>
         <w:tc>
           <w:tcPr>
-            <w:tcW w:type="dxa" w:w="916"/>
+            <w:tcW w:type="dxa" w:w="929"/>
           </w:tcPr>
           <w:p>
             <w:r/>
@@ -449,7 +450,7 @@
         </w:tc>
         <w:tc>
           <w:tcPr>
-            <w:tcW w:type="dxa" w:w="916"/>
+            <w:tcW w:type="dxa" w:w="929"/>
           </w:tcPr>
           <w:p>
             <w:r/>
@@ -457,7 +458,7 @@
         </w:tc>
         <w:tc>
           <w:tcPr>
-            <w:tcW w:type="dxa" w:w="916"/>
+            <w:tcW w:type="dxa" w:w="929"/>
           </w:tcPr>
           <w:p>
             <w:r/>
@@ -465,7 +466,7 @@
         </w:tc>
         <w:tc>
           <w:tcPr>
-            <w:tcW w:type="dxa" w:w="916"/>
+            <w:tcW w:type="dxa" w:w="929"/>
           </w:tcPr>
           <w:p>
             <w:r/>
@@ -473,7 +474,7 @@
         </w:tc>
         <w:tc>
           <w:tcPr>
-            <w:tcW w:type="dxa" w:w="916"/>
+            <w:tcW w:type="dxa" w:w="929"/>
           </w:tcPr>
           <w:p>
             <w:r/>
@@ -481,7 +482,7 @@
         </w:tc>
         <w:tc>
           <w:tcPr>
-            <w:tcW w:type="dxa" w:w="916"/>
+            <w:tcW w:type="dxa" w:w="929"/>
           </w:tcPr>
           <w:p>
             <w:r/>
@@ -489,7 +490,7 @@
         </w:tc>
         <w:tc>
           <w:tcPr>
-            <w:tcW w:type="dxa" w:w="916"/>
+            <w:tcW w:type="dxa" w:w="929"/>
           </w:tcPr>
           <w:p>
             <w:r/>
@@ -497,7 +498,7 @@
         </w:tc>
         <w:tc>
           <w:tcPr>
-            <w:tcW w:type="dxa" w:w="916"/>
+            <w:tcW w:type="dxa" w:w="929"/>
           </w:tcPr>
           <w:p>
             <w:r/>
@@ -505,7 +506,7 @@
         </w:tc>
         <w:tc>
           <w:tcPr>
-            <w:tcW w:type="dxa" w:w="916"/>
+            <w:tcW w:type="dxa" w:w="929"/>
           </w:tcPr>
           <w:p>
             <w:r/>
@@ -515,7 +516,7 @@
       <w:tr>
         <w:tc>
           <w:tcPr>
-            <w:tcW w:type="dxa" w:w="916"/>
+            <w:tcW w:type="dxa" w:w="929"/>
           </w:tcPr>
           <w:p>
             <w:r/>
@@ -523,7 +524,7 @@
         </w:tc>
         <w:tc>
           <w:tcPr>
-            <w:tcW w:type="dxa" w:w="916"/>
+            <w:tcW w:type="dxa" w:w="929"/>
           </w:tcPr>
           <w:p>
             <w:r/>
@@ -531,7 +532,7 @@
         </w:tc>
         <w:tc>
           <w:tcPr>
-            <w:tcW w:type="dxa" w:w="916"/>
+            <w:tcW w:type="dxa" w:w="929"/>
           </w:tcPr>
           <w:p>
             <w:r/>
@@ -539,7 +540,7 @@
         </w:tc>
         <w:tc>
           <w:tcPr>
-            <w:tcW w:type="dxa" w:w="916"/>
+            <w:tcW w:type="dxa" w:w="929"/>
           </w:tcPr>
           <w:p>
             <w:r/>
@@ -547,7 +548,7 @@
         </w:tc>
         <w:tc>
           <w:tcPr>
-            <w:tcW w:type="dxa" w:w="916"/>
+            <w:tcW w:type="dxa" w:w="929"/>
           </w:tcPr>
           <w:p>
             <w:r/>
@@ -555,7 +556,7 @@
         </w:tc>
         <w:tc>
           <w:tcPr>
-            <w:tcW w:type="dxa" w:w="916"/>
+            <w:tcW w:type="dxa" w:w="929"/>
           </w:tcPr>
           <w:p>
             <w:r/>
@@ -563,7 +564,7 @@
         </w:tc>
         <w:tc>
           <w:tcPr>
-            <w:tcW w:type="dxa" w:w="916"/>
+            <w:tcW w:type="dxa" w:w="929"/>
           </w:tcPr>
           <w:p>
             <w:r/>
@@ -571,7 +572,7 @@
         </w:tc>
         <w:tc>
           <w:tcPr>
-            <w:tcW w:type="dxa" w:w="916"/>
+            <w:tcW w:type="dxa" w:w="929"/>
           </w:tcPr>
           <w:p>
             <w:r/>
@@ -579,7 +580,7 @@
         </w:tc>
         <w:tc>
           <w:tcPr>
-            <w:tcW w:type="dxa" w:w="916"/>
+            <w:tcW w:type="dxa" w:w="929"/>
           </w:tcPr>
           <w:p>
             <w:r/>
@@ -587,7 +588,7 @@
         </w:tc>
         <w:tc>
           <w:tcPr>
-            <w:tcW w:type="dxa" w:w="916"/>
+            <w:tcW w:type="dxa" w:w="929"/>
           </w:tcPr>
           <w:p>
             <w:r/>
@@ -595,7 +596,7 @@
         </w:tc>
         <w:tc>
           <w:tcPr>
-            <w:tcW w:type="dxa" w:w="916"/>
+            <w:tcW w:type="dxa" w:w="929"/>
           </w:tcPr>
           <w:p>
             <w:r/>
@@ -605,7 +606,7 @@
       <w:tr>
         <w:tc>
           <w:tcPr>
-            <w:tcW w:type="dxa" w:w="916"/>
+            <w:tcW w:type="dxa" w:w="929"/>
           </w:tcPr>
           <w:p>
             <w:r/>
@@ -613,7 +614,7 @@
         </w:tc>
         <w:tc>
           <w:tcPr>
-            <w:tcW w:type="dxa" w:w="916"/>
+            <w:tcW w:type="dxa" w:w="929"/>
           </w:tcPr>
           <w:p>
             <w:r/>
@@ -621,7 +622,7 @@
         </w:tc>
         <w:tc>
           <w:tcPr>
-            <w:tcW w:type="dxa" w:w="916"/>
+            <w:tcW w:type="dxa" w:w="929"/>
           </w:tcPr>
           <w:p>
             <w:r/>
@@ -629,7 +630,7 @@
         </w:tc>
         <w:tc>
           <w:tcPr>
-            <w:tcW w:type="dxa" w:w="916"/>
+            <w:tcW w:type="dxa" w:w="929"/>
           </w:tcPr>
           <w:p>
             <w:r/>
@@ -637,7 +638,7 @@
         </w:tc>
         <w:tc>
           <w:tcPr>
-            <w:tcW w:type="dxa" w:w="916"/>
+            <w:tcW w:type="dxa" w:w="929"/>
           </w:tcPr>
           <w:p>
             <w:r/>
@@ -645,7 +646,7 @@
         </w:tc>
         <w:tc>
           <w:tcPr>
-            <w:tcW w:type="dxa" w:w="916"/>
+            <w:tcW w:type="dxa" w:w="929"/>
           </w:tcPr>
           <w:p>
             <w:r/>
@@ -653,7 +654,7 @@
         </w:tc>
         <w:tc>
           <w:tcPr>
-            <w:tcW w:type="dxa" w:w="916"/>
+            <w:tcW w:type="dxa" w:w="929"/>
           </w:tcPr>
           <w:p>
             <w:r/>
@@ -661,7 +662,7 @@
         </w:tc>
         <w:tc>
           <w:tcPr>
-            <w:tcW w:type="dxa" w:w="916"/>
+            <w:tcW w:type="dxa" w:w="929"/>
           </w:tcPr>
           <w:p>
             <w:r/>
@@ -669,7 +670,7 @@
         </w:tc>
         <w:tc>
           <w:tcPr>
-            <w:tcW w:type="dxa" w:w="916"/>
+            <w:tcW w:type="dxa" w:w="929"/>
           </w:tcPr>
           <w:p>
             <w:r/>
@@ -677,7 +678,7 @@
         </w:tc>
         <w:tc>
           <w:tcPr>
-            <w:tcW w:type="dxa" w:w="916"/>
+            <w:tcW w:type="dxa" w:w="929"/>
           </w:tcPr>
           <w:p>
             <w:r/>
@@ -685,7 +686,7 @@
         </w:tc>
         <w:tc>
           <w:tcPr>
-            <w:tcW w:type="dxa" w:w="916"/>
+            <w:tcW w:type="dxa" w:w="929"/>
           </w:tcPr>
           <w:p>
             <w:r/>
@@ -731,7 +732,7 @@
     </w:p>
     <w:sectPr>
       <w:pgSz w:w="12240" w:h="15840"/>
-      <w:pgMar w:top="1008" w:right="1080" w:bottom="1008" w:left="1080" w:header="720" w:footer="720" w:gutter="0"/>
+      <w:pgMar w:top="864" w:right="1008" w:bottom="864" w:left="1008" w:header="720" w:footer="720" w:gutter="0"/>
       <w:cols w:space="720"/>
       <w:docGrid w:linePitch="360"/>
     </w:sectPr>
@@ -1103,8 +1104,8 @@
     <w:qFormat/>
     <w:rsid w:val="00FC693F"/>
     <w:rPr>
-      <w:rFonts w:ascii="Aptos" w:hAnsi="Aptos" w:eastAsia="Microsoft YaHei"/>
-      <w:sz w:val="20"/>
+      <w:rFonts w:ascii="Aptos" w:hAnsi="Aptos" w:eastAsia="Hiragino Sans GB"/>
+      <w:sz w:val="19"/>
     </w:rPr>
   </w:style>
   <w:style w:type="paragraph" w:styleId="Header">

</xml_diff>